<commit_message>
docs: Adicionando documentação final
</commit_message>
<xml_diff>
--- a/Documentação/SMIN-DOCUMENTACAO-V3.0.docx
+++ b/Documentação/SMIN-DOCUMENTACAO-V3.0.docx
@@ -498,19 +498,8 @@
           <w:sz w:val="22"/>
           <w:szCs w:val="22"/>
         </w:rPr>
-        <w:t xml:space="preserve">Giovanna </w:t>
+        <w:t>Giovanna Canalez</w:t>
       </w:r>
-      <w:proofErr w:type="spellStart"/>
-      <w:r>
-        <w:rPr>
-          <w:rFonts w:ascii="Monospac821 BT" w:eastAsia="Arial" w:hAnsi="Monospac821 BT" w:cs="Arial"/>
-          <w:color w:val="000000" w:themeColor="text1"/>
-          <w:sz w:val="22"/>
-          <w:szCs w:val="22"/>
-        </w:rPr>
-        <w:t>Canalez</w:t>
-      </w:r>
-      <w:proofErr w:type="spellEnd"/>
       <w:r>
         <w:rPr>
           <w:rFonts w:ascii="Monospac821 BT" w:eastAsia="Arial" w:hAnsi="Monospac821 BT" w:cs="Arial"/>
@@ -771,16 +760,7 @@
           <w:sz w:val="22"/>
           <w:szCs w:val="22"/>
         </w:rPr>
-        <w:t xml:space="preserve">Dentro do estado de São Paulo, o varejo apresenta crescimento, refletindo tanto a importância econômica da região quanto o papel estratégico das decisões de exposição de produtos no ponto de </w:t>
-      </w:r>
-      <w:r>
-        <w:rPr>
-          <w:rFonts w:ascii="Monospac821 BT" w:hAnsi="Monospac821 BT"/>
-          <w:sz w:val="22"/>
-          <w:szCs w:val="22"/>
-        </w:rPr>
-        <w:lastRenderedPageBreak/>
-        <w:t>venda. Estudos regionais indicam, por exemplo, variações significativas nos preços de itens essenciais e diferenças no comportamento de compra entre diferentes bairros da capital, o que demonstra a complexidade e a necessidade de dados mais detalhados para compreender as preferências e hábitos de consumo da população paulista.</w:t>
+        <w:t>Dentro do estado de São Paulo, o varejo apresenta crescimento, refletindo tanto a importância econômica da região quanto o papel estratégico das decisões de exposição de produtos no ponto de venda. Estudos regionais indicam, por exemplo, variações significativas nos preços de itens essenciais e diferenças no comportamento de compra entre diferentes bairros da capital, o que demonstra a complexidade e a necessidade de dados mais detalhados para compreender as preferências e hábitos de consumo da população paulista.</w:t>
       </w:r>
     </w:p>
     <w:p>
@@ -844,6 +824,7 @@
           <w:sz w:val="28"/>
           <w:szCs w:val="28"/>
         </w:rPr>
+        <w:lastRenderedPageBreak/>
         <w:t>OBJETIVO</w:t>
       </w:r>
     </w:p>
@@ -950,16 +931,7 @@
           <w:sz w:val="22"/>
           <w:szCs w:val="22"/>
         </w:rPr>
-        <w:t xml:space="preserve">A relevância deste projeto está diretamente relacionada à necessidade de eliminar um dos principais pontos cegos do varejo físico: o comportamento do consumidor no momento que antecede a compra. Atualmente, os sistemas de PDV registram apenas a venda finalizada, impossibilitando a compreensão das razões pelas quais determinados produtos despertam interesse, mas não são efetivamente adquiridos, gerando perdas invisíveis de </w:t>
-      </w:r>
-      <w:r>
-        <w:rPr>
-          <w:rFonts w:ascii="Monospac821 BT" w:hAnsi="Monospac821 BT"/>
-          <w:sz w:val="22"/>
-          <w:szCs w:val="22"/>
-        </w:rPr>
-        <w:lastRenderedPageBreak/>
-        <w:t>oportunidade e receita. Além disso, a proposta se destaca por seu baixo custo de implementação, tornando viável a aplicação de inteligência de negócio mesmo em pequenos e médios varejistas, ao mesmo tempo em que promove uma gestão orientada a dados, na qual decisões passam a ser baseadas em evidências concretas, aumentando a eficiência operacional e o potencial de vendas.</w:t>
+        <w:t>A relevância deste projeto está diretamente relacionada à necessidade de eliminar um dos principais pontos cegos do varejo físico: o comportamento do consumidor no momento que antecede a compra. Atualmente, os sistemas de PDV registram apenas a venda finalizada, impossibilitando a compreensão das razões pelas quais determinados produtos despertam interesse, mas não são efetivamente adquiridos, gerando perdas invisíveis de oportunidade e receita. Além disso, a proposta se destaca por seu baixo custo de implementação, tornando viável a aplicação de inteligência de negócio mesmo em pequenos e médios varejistas, ao mesmo tempo em que promove uma gestão orientada a dados, na qual decisões passam a ser baseadas em evidências concretas, aumentando a eficiência operacional e o potencial de vendas.</w:t>
       </w:r>
     </w:p>
     <w:p>
@@ -1050,7 +1022,16 @@
           <w:sz w:val="22"/>
           <w:szCs w:val="22"/>
         </w:rPr>
-        <w:t>A proposta baseia-se na oferta do sistema como uma solução tecnológica para fabricantes que buscam compreender o comportamento dos consumidores no momento da compra. Atualmente, essas empresas contam principalmente com dados de vendas efetivadas, que indicam apenas o resultado da compra. Entretanto, esses dados não expressam o grau de interesse demonstrado pelo cliente antes d</w:t>
+        <w:t xml:space="preserve">A proposta baseia-se na oferta do sistema como uma solução tecnológica para fabricantes que buscam compreender o comportamento dos consumidores no momento da compra. Atualmente, essas empresas contam principalmente com dados de vendas efetivadas, que </w:t>
+      </w:r>
+      <w:r>
+        <w:rPr>
+          <w:rFonts w:ascii="Monospac821 BT" w:eastAsia="Times New Roman" w:hAnsi="Monospac821 BT" w:cs="Times New Roman"/>
+          <w:sz w:val="22"/>
+          <w:szCs w:val="22"/>
+        </w:rPr>
+        <w:lastRenderedPageBreak/>
+        <w:t>indicam apenas o resultado da compra. Entretanto, esses dados não expressam o grau de interesse demonstrado pelo cliente antes d</w:t>
       </w:r>
       <w:r>
         <w:rPr>
@@ -1136,7 +1117,6 @@
           <w:b/>
           <w:bCs/>
         </w:rPr>
-        <w:lastRenderedPageBreak/>
         <w:t>RESULTADOS ESPERADOS</w:t>
       </w:r>
     </w:p>
@@ -1468,6 +1448,7 @@
           <w:sz w:val="22"/>
           <w:szCs w:val="22"/>
         </w:rPr>
+        <w:lastRenderedPageBreak/>
         <w:t xml:space="preserve">Edição de produtos/setores existentes: </w:t>
       </w:r>
       <w:r>
@@ -1575,7 +1556,6 @@
           <w:sz w:val="22"/>
           <w:szCs w:val="22"/>
         </w:rPr>
-        <w:lastRenderedPageBreak/>
         <w:t>Armazenamento de dados:</w:t>
       </w:r>
       <w:r>
@@ -1970,6 +1950,7 @@
           <w:sz w:val="28"/>
           <w:szCs w:val="28"/>
         </w:rPr>
+        <w:lastRenderedPageBreak/>
         <w:t>MACRO CRONOGRAMA</w:t>
       </w:r>
     </w:p>
@@ -1989,7 +1970,6 @@
           <w:sz w:val="22"/>
           <w:szCs w:val="22"/>
         </w:rPr>
-        <w:lastRenderedPageBreak/>
         <w:t>O macro cronograma apresenta uma visão geral das principais fases do projeto, distribuídas ao longo de 68 dias úteis, organizadas em três sprints até a entrega final em 01 de junho de 2026.</w:t>
       </w:r>
     </w:p>
@@ -2034,9 +2014,9 @@
         <w:tblLook w:val="04A0" w:firstRow="1" w:lastRow="0" w:firstColumn="1" w:lastColumn="0" w:noHBand="0" w:noVBand="1"/>
       </w:tblPr>
       <w:tblGrid>
-        <w:gridCol w:w="2368"/>
-        <w:gridCol w:w="4584"/>
-        <w:gridCol w:w="1692"/>
+        <w:gridCol w:w="2306"/>
+        <w:gridCol w:w="4640"/>
+        <w:gridCol w:w="1698"/>
       </w:tblGrid>
       <w:tr>
         <w:trPr>
@@ -2821,9 +2801,9 @@
         <w:tblLook w:val="0680" w:firstRow="0" w:lastRow="0" w:firstColumn="1" w:lastColumn="0" w:noHBand="1" w:noVBand="1"/>
       </w:tblPr>
       <w:tblGrid>
-        <w:gridCol w:w="4204"/>
-        <w:gridCol w:w="1664"/>
-        <w:gridCol w:w="2620"/>
+        <w:gridCol w:w="4214"/>
+        <w:gridCol w:w="1630"/>
+        <w:gridCol w:w="2644"/>
       </w:tblGrid>
       <w:tr>
         <w:trPr>
@@ -3307,7 +3287,6 @@
                 <w:sz w:val="22"/>
                 <w:szCs w:val="22"/>
               </w:rPr>
-              <w:lastRenderedPageBreak/>
               <w:t>Analista de Sistemas</w:t>
             </w:r>
           </w:p>
@@ -3712,6 +3691,7 @@
                 <w:sz w:val="22"/>
                 <w:szCs w:val="22"/>
               </w:rPr>
+              <w:lastRenderedPageBreak/>
               <w:t xml:space="preserve">Kits de Monitoramento </w:t>
             </w:r>
             <w:proofErr w:type="gramStart"/>
@@ -4745,7 +4725,6 @@
                 <w:sz w:val="22"/>
                 <w:szCs w:val="22"/>
               </w:rPr>
-              <w:lastRenderedPageBreak/>
               <w:t>Geração de relatórios</w:t>
             </w:r>
           </w:p>
@@ -5009,6 +4988,7 @@
                 <w:sz w:val="22"/>
                 <w:szCs w:val="22"/>
               </w:rPr>
+              <w:lastRenderedPageBreak/>
               <w:t>Ser intuitivo.</w:t>
             </w:r>
           </w:p>
@@ -5197,9 +5177,9 @@
         <w:tblLook w:val="06A0" w:firstRow="1" w:lastRow="0" w:firstColumn="1" w:lastColumn="0" w:noHBand="1" w:noVBand="1"/>
       </w:tblPr>
       <w:tblGrid>
-        <w:gridCol w:w="2427"/>
-        <w:gridCol w:w="2146"/>
-        <w:gridCol w:w="3915"/>
+        <w:gridCol w:w="2411"/>
+        <w:gridCol w:w="2031"/>
+        <w:gridCol w:w="4046"/>
       </w:tblGrid>
       <w:tr>
         <w:trPr>
@@ -5718,7 +5698,6 @@
                 <w:sz w:val="22"/>
                 <w:szCs w:val="22"/>
               </w:rPr>
-              <w:lastRenderedPageBreak/>
               <w:t>Desenvolvedor IoT</w:t>
             </w:r>
           </w:p>
@@ -6187,6 +6166,7 @@
                 <w:sz w:val="22"/>
                 <w:szCs w:val="22"/>
               </w:rPr>
+              <w:lastRenderedPageBreak/>
               <w:t>Requisito</w:t>
             </w:r>
           </w:p>
@@ -6533,16 +6513,7 @@
                 <w:sz w:val="22"/>
                 <w:szCs w:val="22"/>
               </w:rPr>
-              <w:t xml:space="preserve">Calculadora com métricas baseadas </w:t>
-            </w:r>
-            <w:r>
-              <w:rPr>
-                <w:rFonts w:ascii="Monospac821 BT" w:hAnsi="Monospac821 BT" w:cs="Times New Roman"/>
-                <w:sz w:val="22"/>
-                <w:szCs w:val="22"/>
-              </w:rPr>
-              <w:lastRenderedPageBreak/>
-              <w:t>em trade marketing</w:t>
+              <w:t>Calculadora com métricas baseadas em trade marketing</w:t>
             </w:r>
           </w:p>
         </w:tc>
@@ -6565,17 +6536,7 @@
                 <w:sz w:val="22"/>
                 <w:szCs w:val="22"/>
               </w:rPr>
-              <w:lastRenderedPageBreak/>
-              <w:t xml:space="preserve">Calcular nível de interesse no produto e tempo de </w:t>
-            </w:r>
-            <w:r>
-              <w:rPr>
-                <w:rFonts w:ascii="Monospac821 BT" w:hAnsi="Monospac821 BT" w:cs="Times New Roman"/>
-                <w:sz w:val="22"/>
-                <w:szCs w:val="22"/>
-              </w:rPr>
-              <w:lastRenderedPageBreak/>
-              <w:t>retenção do cliente em loja</w:t>
+              <w:t>Calcular nível de interesse no produto e tempo de retenção do cliente em loja</w:t>
             </w:r>
           </w:p>
         </w:tc>
@@ -6599,7 +6560,6 @@
                 <w:sz w:val="22"/>
                 <w:szCs w:val="22"/>
               </w:rPr>
-              <w:lastRenderedPageBreak/>
               <w:t>Importante</w:t>
             </w:r>
           </w:p>
@@ -7101,7 +7061,6 @@
           <w:sz w:val="22"/>
           <w:szCs w:val="22"/>
         </w:rPr>
-        <w:lastRenderedPageBreak/>
         <w:t>A aproximação do consumidor ao produto resultará na variação da distância detectada pelo sensor, permitindo a identificação de interações.</w:t>
       </w:r>
     </w:p>
@@ -7457,17 +7416,7 @@
             <w:sz w:val="22"/>
             <w:szCs w:val="22"/>
           </w:rPr>
-          <w:t>https://www.fecomercio.com.br/noticia/vendas-no-</w:t>
-        </w:r>
-        <w:r>
-          <w:rPr>
-            <w:rStyle w:val="Hyperlink"/>
-            <w:rFonts w:ascii="Monospac821 BT" w:eastAsia="Aptos" w:hAnsi="Monospac821 BT" w:cs="Aptos"/>
-            <w:sz w:val="22"/>
-            <w:szCs w:val="22"/>
-          </w:rPr>
-          <w:lastRenderedPageBreak/>
-          <w:t>varejo-tem-alta-de-8-9-em-fevereiro-mesmo-com-inflacao-e-juros-elevados-aponta-pesquisa</w:t>
+          <w:t>https://www.fecomercio.com.br/noticia/vendas-no-varejo-tem-alta-de-8-9-em-fevereiro-mesmo-com-inflacao-e-juros-elevados-aponta-pesquisa</w:t>
         </w:r>
       </w:hyperlink>
       <w:r>
@@ -7476,7 +7425,16 @@
           <w:sz w:val="22"/>
           <w:szCs w:val="22"/>
         </w:rPr>
-        <w:t>. Acesso em: 26 fev. 2026.</w:t>
+        <w:t xml:space="preserve">. Acesso em: 26 fev. </w:t>
+      </w:r>
+      <w:r>
+        <w:rPr>
+          <w:rFonts w:ascii="Monospac821 BT" w:eastAsia="Aptos" w:hAnsi="Monospac821 BT" w:cs="Aptos"/>
+          <w:sz w:val="22"/>
+          <w:szCs w:val="22"/>
+        </w:rPr>
+        <w:lastRenderedPageBreak/>
+        <w:t>2026.</w:t>
       </w:r>
       <w:r>
         <w:rPr>
@@ -7585,16 +7543,7 @@
             <w:sz w:val="22"/>
             <w:szCs w:val="22"/>
           </w:rPr>
-          <w:t>https://www.gopazo.com/blog/retail-shelf-strategy</w:t>
-        </w:r>
-        <w:r>
-          <w:rPr>
-            <w:rStyle w:val="Hyperlink"/>
-            <w:rFonts w:ascii="Monospac821 BT" w:hAnsi="Monospac821 BT"/>
-            <w:sz w:val="22"/>
-            <w:szCs w:val="22"/>
-          </w:rPr>
-          <w:t>/</w:t>
+          <w:t>https://www.gopazo.com/blog/retail-shelf-strategy/</w:t>
         </w:r>
       </w:hyperlink>
       <w:r>
@@ -7673,7 +7622,7 @@
         </w:rPr>
         <w:t xml:space="preserve"> </w:t>
       </w:r>
-      <w:hyperlink r:id="rId13" w:history="1">
+      <w:hyperlink r:id="rId13" w:anchor=":~:text=Retail%20Sensing%20May%207,%202024,in%20dwell%20time%20and%20sales" w:history="1">
         <w:r>
           <w:rPr>
             <w:rStyle w:val="Hyperlink"/>
@@ -14253,6 +14202,7 @@
   <w:style w:type="character" w:default="1" w:styleId="Fontepargpadro">
     <w:name w:val="Default Paragraph Font"/>
     <w:uiPriority w:val="1"/>
+    <w:semiHidden/>
     <w:unhideWhenUsed/>
   </w:style>
   <w:style w:type="table" w:default="1" w:styleId="Tabelanormal">

</xml_diff>